<commit_message>
Add AWeber list exports and related intake, lead-card, and clip docs.
Co-authored-by: Cursor <cursoragent@cursor.com>
</commit_message>
<xml_diff>
--- a/docs/20280801RichardWeatherman.com-Client_intake.docx
+++ b/docs/20280801RichardWeatherman.com-Client_intake.docx
@@ -3747,8 +3747,16 @@
               <w:rPr>
                 <w:sz w:val="20"/>
               </w:rPr>
-              <w:t>Sovereign Life Control, Reachforthestars.today</w:t>
-            </w:r>
+              <w:t xml:space="preserve">Sovereign Life Control, </w:t>
+            </w:r>
+            <w:proofErr w:type="spellStart"/>
+            <w:r>
+              <w:rPr>
+                <w:sz w:val="20"/>
+              </w:rPr>
+              <w:t>Reachforthestars.today</w:t>
+            </w:r>
+            <w:proofErr w:type="spellEnd"/>
             <w:r>
               <w:rPr>
                 <w:sz w:val="20"/>
@@ -5118,8 +5126,39 @@
                 <w:w w:val="105"/>
                 <w:sz w:val="17"/>
               </w:rPr>
-              <w:t xml:space="preserve"> (MAJOR BRANDS USED  ie  Shaklee  etc</w:t>
-            </w:r>
+              <w:t xml:space="preserve"> (MAJOR BRANDS USED  </w:t>
+            </w:r>
+            <w:proofErr w:type="spellStart"/>
+            <w:r>
+              <w:rPr>
+                <w:b/>
+                <w:color w:val="00B050"/>
+                <w:w w:val="105"/>
+                <w:sz w:val="17"/>
+              </w:rPr>
+              <w:t>ie</w:t>
+            </w:r>
+            <w:proofErr w:type="spellEnd"/>
+            <w:r>
+              <w:rPr>
+                <w:b/>
+                <w:color w:val="00B050"/>
+                <w:w w:val="105"/>
+                <w:sz w:val="17"/>
+              </w:rPr>
+              <w:t xml:space="preserve">  Shaklee  </w:t>
+            </w:r>
+            <w:proofErr w:type="spellStart"/>
+            <w:r>
+              <w:rPr>
+                <w:b/>
+                <w:color w:val="00B050"/>
+                <w:w w:val="105"/>
+                <w:sz w:val="17"/>
+              </w:rPr>
+              <w:t>etc</w:t>
+            </w:r>
+            <w:proofErr w:type="spellEnd"/>
             <w:r>
               <w:rPr>
                 <w:b/>
@@ -7606,7 +7645,16 @@
                 <w:w w:val="110"/>
                 <w:sz w:val="15"/>
               </w:rPr>
-              <w:t>l AM A HYP</w:t>
+              <w:t xml:space="preserve">l AM A </w:t>
+            </w:r>
+            <w:proofErr w:type="spellStart"/>
+            <w:r>
+              <w:rPr>
+                <w:color w:val="1A1A1A"/>
+                <w:w w:val="110"/>
+                <w:sz w:val="15"/>
+              </w:rPr>
+              <w:t>HYP</w:t>
             </w:r>
             <w:r>
               <w:rPr>
@@ -7622,7 +7670,16 @@
                 <w:w w:val="110"/>
                 <w:sz w:val="15"/>
               </w:rPr>
-              <w:t>OTHERAPlST INTERES</w:t>
+              <w:t>OTHERAPlST</w:t>
+            </w:r>
+            <w:proofErr w:type="spellEnd"/>
+            <w:r>
+              <w:rPr>
+                <w:color w:val="1A1A1A"/>
+                <w:w w:val="110"/>
+                <w:sz w:val="15"/>
+              </w:rPr>
+              <w:t xml:space="preserve"> INTERES</w:t>
             </w:r>
             <w:r>
               <w:rPr>
@@ -7670,7 +7727,16 @@
                 <w:w w:val="110"/>
                 <w:sz w:val="15"/>
               </w:rPr>
-              <w:t>O SELF ACT</w:t>
+              <w:t xml:space="preserve">O SELF </w:t>
+            </w:r>
+            <w:proofErr w:type="spellStart"/>
+            <w:r>
+              <w:rPr>
+                <w:color w:val="1A1A1A"/>
+                <w:w w:val="110"/>
+                <w:sz w:val="15"/>
+              </w:rPr>
+              <w:t>ACT</w:t>
             </w:r>
             <w:r>
               <w:rPr>
@@ -7704,6 +7770,7 @@
               </w:rPr>
               <w:t>lZATlON</w:t>
             </w:r>
+            <w:proofErr w:type="spellEnd"/>
             <w:r>
               <w:rPr>
                 <w:color w:val="1A1A1A"/>
@@ -12101,8 +12168,21 @@
           <w:szCs w:val="18"/>
           <w:lang w:eastAsia="ja-JP"/>
         </w:rPr>
-        <w:t>_a</w:t>
-      </w:r>
+        <w:t>_</w:t>
+      </w:r>
+      <w:proofErr w:type="spellStart"/>
+      <w:r>
+        <w:rPr>
+          <w:rFonts w:ascii="Arial Narrow" w:eastAsia="MS Mincho" w:hAnsi="Arial Narrow" w:cs="Times New Roman"/>
+          <w:bCs/>
+          <w:color w:val="000000"/>
+          <w:sz w:val="18"/>
+          <w:szCs w:val="18"/>
+          <w:lang w:eastAsia="ja-JP"/>
+        </w:rPr>
+        <w:t>a</w:t>
+      </w:r>
+      <w:proofErr w:type="spellEnd"/>
       <w:r>
         <w:rPr>
           <w:rFonts w:ascii="Arial Narrow" w:eastAsia="MS Mincho" w:hAnsi="Arial Narrow" w:cs="Times New Roman"/>
@@ -13334,7 +13414,31 @@
           <w:szCs w:val="18"/>
           <w:lang w:eastAsia="ja-JP"/>
         </w:rPr>
-        <w:t xml:space="preserve"> Enhancement </w:t>
+        <w:t xml:space="preserve"> </w:t>
+      </w:r>
+      <w:proofErr w:type="spellStart"/>
+      <w:r>
+        <w:rPr>
+          <w:rFonts w:ascii="Arial Narrow" w:eastAsia="MS Mincho" w:hAnsi="Arial Narrow" w:cs="Times New Roman"/>
+          <w:bCs/>
+          <w:color w:val="000000"/>
+          <w:sz w:val="18"/>
+          <w:szCs w:val="18"/>
+          <w:lang w:eastAsia="ja-JP"/>
+        </w:rPr>
+        <w:t>Enhancement</w:t>
+      </w:r>
+      <w:proofErr w:type="spellEnd"/>
+      <w:r>
+        <w:rPr>
+          <w:rFonts w:ascii="Arial Narrow" w:eastAsia="MS Mincho" w:hAnsi="Arial Narrow" w:cs="Times New Roman"/>
+          <w:bCs/>
+          <w:color w:val="000000"/>
+          <w:sz w:val="18"/>
+          <w:szCs w:val="18"/>
+          <w:lang w:eastAsia="ja-JP"/>
+        </w:rPr>
+        <w:t xml:space="preserve"> </w:t>
       </w:r>
       <w:r>
         <w:rPr>
@@ -13578,6 +13682,7 @@
         </w:rPr>
         <w:t>39. ___</w:t>
       </w:r>
+      <w:proofErr w:type="spellStart"/>
       <w:r>
         <w:rPr>
           <w:rFonts w:ascii="Arial Narrow" w:eastAsia="Times New Roman" w:hAnsi="Arial Narrow"/>
@@ -13594,7 +13699,17 @@
           <w:sz w:val="18"/>
           <w:szCs w:val="18"/>
         </w:rPr>
-        <w:t xml:space="preserve">__Concentration , Focus &amp; Memory  </w:t>
+        <w:t>__Concentration</w:t>
+      </w:r>
+      <w:proofErr w:type="spellEnd"/>
+      <w:r>
+        <w:rPr>
+          <w:rFonts w:ascii="Arial Narrow" w:eastAsia="Times New Roman" w:hAnsi="Arial Narrow"/>
+          <w:b/>
+          <w:sz w:val="18"/>
+          <w:szCs w:val="18"/>
+        </w:rPr>
+        <w:t xml:space="preserve"> , Focus &amp; Memory  </w:t>
       </w:r>
       <w:r>
         <w:rPr>
@@ -14282,6 +14397,7 @@
         </w:rPr>
         <w:t xml:space="preserve">                  _____   </w:t>
       </w:r>
+      <w:proofErr w:type="spellStart"/>
       <w:r>
         <w:rPr>
           <w:rFonts w:ascii="Arial Narrow" w:eastAsia="Times New Roman" w:hAnsi="Arial Narrow"/>
@@ -14290,6 +14406,7 @@
         </w:rPr>
         <w:t>Self Sabotage</w:t>
       </w:r>
+      <w:proofErr w:type="spellEnd"/>
       <w:r>
         <w:rPr>
           <w:rFonts w:ascii="Arial Narrow" w:eastAsia="Times New Roman" w:hAnsi="Arial Narrow"/>
@@ -18683,7 +18800,29 @@
           <w:szCs w:val="18"/>
           <w:lang w:eastAsia="ja-JP"/>
         </w:rPr>
-        <w:t xml:space="preserve"> _____ a  Abortion /  Miscarriage / Stillbirth /( Circle Answer)                                </w:t>
+        <w:t xml:space="preserve"> _____ </w:t>
+      </w:r>
+      <w:proofErr w:type="spellStart"/>
+      <w:r>
+        <w:rPr>
+          <w:rFonts w:ascii="Arial Narrow" w:eastAsia="MS Mincho" w:hAnsi="Arial Narrow" w:cs="Times New Roman"/>
+          <w:color w:val="000000"/>
+          <w:sz w:val="18"/>
+          <w:szCs w:val="18"/>
+          <w:lang w:eastAsia="ja-JP"/>
+        </w:rPr>
+        <w:t>a</w:t>
+      </w:r>
+      <w:proofErr w:type="spellEnd"/>
+      <w:r>
+        <w:rPr>
+          <w:rFonts w:ascii="Arial Narrow" w:eastAsia="MS Mincho" w:hAnsi="Arial Narrow" w:cs="Times New Roman"/>
+          <w:color w:val="000000"/>
+          <w:sz w:val="18"/>
+          <w:szCs w:val="18"/>
+          <w:lang w:eastAsia="ja-JP"/>
+        </w:rPr>
+        <w:t xml:space="preserve">  Abortion /  Miscarriage / Stillbirth /( Circle Answer)                                </w:t>
       </w:r>
       <w:r>
         <w:rPr>
@@ -22736,6 +22875,7 @@
         </w:rPr>
         <w:t xml:space="preserve"> </w:t>
       </w:r>
+      <w:proofErr w:type="spellStart"/>
       <w:r>
         <w:t>self</w:t>
       </w:r>
@@ -22746,7 +22886,11 @@
         <w:t xml:space="preserve"> </w:t>
       </w:r>
       <w:r>
-        <w:t>esteem,</w:t>
+        <w:t>esteem</w:t>
+      </w:r>
+      <w:proofErr w:type="spellEnd"/>
+      <w:r>
+        <w:t>,</w:t>
       </w:r>
       <w:r>
         <w:rPr>

</xml_diff>